<commit_message>
fix(reports): Word formatting from a user's review of a 117-page report (2.533.1)
Summary of findings gains a Systems column; every pipe-table separator is
over 72 characters (Scope by site, Networks and Domains printed as narrow
centred boxes); "N systems are affected.", "Command:" and "Output:" are
Table Label; the confirmation's lead line keeps its newline. reference.docx
(both copies): a wrapping Source Code style, Consolas on Verbatim Char (code
printed in the body font), Image Caption spacing, Heading 3–5 bold and
sized. Guard tests for each; the shipped-templates test checks the
separator rule over every data shape.

Co-Authored-By: Claude Fable 5.1 <noreply@anthropic.com>
</commit_message>
<xml_diff>
--- a/report-templates/executive-brief/reference.docx
+++ b/report-templates/executive-brief/reference.docx
@@ -3090,6 +3090,7 @@
     <w:pPr>
       <w:keepNext w:val="true"/>
       <w:keepLines/>
+      <w:spacing w:before="240" w:after="120"/>
       <w:outlineLvl w:val="0"/>
     </w:pPr>
     <w:rPr>
@@ -3112,6 +3113,7 @@
     <w:pPr>
       <w:keepNext w:val="true"/>
       <w:keepLines/>
+      <w:spacing w:before="240" w:after="120"/>
       <w:outlineLvl w:val="1"/>
     </w:pPr>
     <w:rPr>
@@ -3134,13 +3136,16 @@
     <w:pPr>
       <w:keepNext w:val="true"/>
       <w:keepLines/>
+      <w:spacing w:before="200" w:after="80"/>
       <w:outlineLvl w:val="2"/>
     </w:pPr>
     <w:rPr>
       <w:rFonts w:eastAsia="" w:cs="" w:cstheme="majorBidi" w:eastAsiaTheme="majorEastAsia"/>
+      <w:b/>
+      <w:bCs/>
       <w:color w:themeColor="text1" w:val="000000"/>
-      <w:sz w:val="28"/>
-      <w:szCs w:val="28"/>
+      <w:sz w:val="24"/>
+      <w:szCs w:val="24"/>
     </w:rPr>
   </w:style>
   <w:style w:type="paragraph" w:styleId="Heading4">
@@ -3156,12 +3161,16 @@
     <w:pPr>
       <w:keepNext w:val="true"/>
       <w:keepLines/>
+      <w:spacing w:before="160" w:after="60"/>
       <w:outlineLvl w:val="3"/>
     </w:pPr>
     <w:rPr>
       <w:rFonts w:eastAsia="" w:cs="" w:cstheme="majorBidi" w:eastAsiaTheme="majorEastAsia"/>
-      <w:iCs/>
+      <w:b/>
+      <w:bCs/>
       <w:color w:themeColor="text1" w:val="000000"/>
+      <w:sz w:val="22"/>
+      <w:szCs w:val="22"/>
     </w:rPr>
   </w:style>
   <w:style w:type="paragraph" w:styleId="Heading5">
@@ -3177,11 +3186,18 @@
     <w:pPr>
       <w:keepNext w:val="true"/>
       <w:keepLines/>
+      <w:spacing w:before="160" w:after="60"/>
       <w:outlineLvl w:val="4"/>
     </w:pPr>
     <w:rPr>
       <w:rFonts w:eastAsia="" w:cs="" w:cstheme="majorBidi" w:eastAsiaTheme="majorEastAsia"/>
+      <w:b/>
+      <w:bCs/>
+      <w:i/>
+      <w:iCs/>
       <w:color w:themeColor="text1" w:val="000000"/>
+      <w:sz w:val="22"/>
+      <w:szCs w:val="22"/>
     </w:rPr>
   </w:style>
   <w:style w:type="paragraph" w:styleId="Heading6">
@@ -3446,10 +3462,14 @@
   </w:style>
   <w:style w:type="character" w:styleId="VerbatimChar" w:customStyle="1">
     <w:name w:val="Verbatim Char"/>
-    <w:basedOn w:val="CaptionChar"/>
+    <w:basedOn w:val="DefaultParagraphFont"/>
     <w:qFormat/>
     <w:rsid w:val="0057607b"/>
-    <w:rPr/>
+    <w:rPr>
+      <w:rFonts w:ascii="Consolas" w:hAnsi="Consolas" w:cs="Consolas" w:eastAsia="Consolas"/>
+      <w:sz w:val="18"/>
+      <w:szCs w:val="18"/>
+    </w:rPr>
   </w:style>
   <w:style w:type="character" w:styleId="SectionNumber" w:customStyle="1">
     <w:name w:val="Section Number"/>
@@ -3794,7 +3814,7 @@
     <w:qFormat/>
     <w:rsid w:val="001547e5"/>
     <w:pPr>
-      <w:spacing w:before="0" w:after="0"/>
+      <w:spacing w:before="60" w:after="200"/>
       <w:jc w:val="center"/>
     </w:pPr>
     <w:rPr>
@@ -4178,6 +4198,30 @@
       <w:jc w:val="left"/>
     </w:pPr>
     <w:rPr/>
+  </w:style>
+  <w:style w:type="paragraph" w:customStyle="1" w:styleId="SourceCode">
+    <w:name w:val="Source Code"/>
+    <w:basedOn w:val="Normal"/>
+    <w:link w:val="VerbatimChar"/>
+    <w:qFormat/>
+    <w:pPr>
+      <w:keepLines/>
+      <w:pBdr>
+        <w:top w:val="single" w:sz="4" w:space="4" w:color="CBD0D6"/>
+        <w:left w:val="single" w:sz="4" w:space="4" w:color="CBD0D6"/>
+        <w:bottom w:val="single" w:sz="4" w:space="4" w:color="CBD0D6"/>
+        <w:right w:val="single" w:sz="4" w:space="4" w:color="CBD0D6"/>
+      </w:pBdr>
+      <w:shd w:val="clear" w:color="auto" w:fill="F1F3F5"/>
+      <w:spacing w:before="120" w:after="160" w:line="240" w:lineRule="auto"/>
+      <w:ind w:left="0" w:firstLine="0"/>
+      <w:jc w:val="left"/>
+    </w:pPr>
+    <w:rPr>
+      <w:rFonts w:ascii="Consolas" w:hAnsi="Consolas" w:cs="Consolas" w:eastAsia="Consolas"/>
+      <w:sz w:val="18"/>
+      <w:szCs w:val="18"/>
+    </w:rPr>
   </w:style>
 </w:styles>
 </file>

</xml_diff>